<commit_message>
Sync promo_doc v12: TOFC 189/$685K + OB NTI 675/$570K (Will's basis-C ruling), Ex5 LPs BfA+EarnTrust, sensitivity doc per-lane corrections, WAPE research + acceptance criteria, AZIM share-out portfolio section
</commit_message>
<xml_diff>
--- a/promo_doc/drafts/AZIM_Midstream_Cost_Avoidance_Review_2026-07-27.docx
+++ b/promo_doc/drafts/AZIM_Midstream_Cost_Avoidance_Review_2026-07-27.docx
@@ -2236,6 +2236,108 @@
         <w:t>The seven cases above cover every load in the WK24–WK30 base: 279 standard same-ramp loads (profiles A/B/C/F), 37 crosstown loads (D/E), and the exclusions (G). Every dollar in the ~$150K total is one of these shapes, tagged MEASURED or EST in the per-VRID detail — happy to walk any specific load end-to-end.</w:t>
       </w:r>
     </w:p>
+    <w:p>
+      <w:pPr>
+        <w:spacing w:after="80"/>
+      </w:pPr>
+      <w:r>
+        <w:rPr>
+          <w:b/>
+          <w:sz w:val="24"/>
+        </w:rPr>
+        <w:t>Related: the other levers we run on this corridor (FYI, updated 7/28)</w:t>
+      </w:r>
+    </w:p>
+    <w:p>
+      <w:pPr>
+        <w:spacing w:after="120"/>
+      </w:pPr>
+      <w:r>
+        <w:rPr>
+          <w:b/>
+          <w:i w:val="0"/>
+          <w:sz w:val="20"/>
+        </w:rPr>
+        <w:t xml:space="preserve">TOFC (Q2, LAS1/VGT2 → MDW2/RFD2/FWA4 with your team building the run structures): </w:t>
+      </w:r>
+      <w:r>
+        <w:rPr>
+          <w:b w:val="0"/>
+          <w:i w:val="0"/>
+          <w:sz w:val="20"/>
+        </w:rPr>
+        <w:t xml:space="preserve">re-audited with the same settlement-actuals discipline as the midstream number above. Ground-truth VRID tracker shows </w:t>
+      </w:r>
+      <w:r>
+        <w:rPr>
+          <w:b/>
+          <w:i w:val="0"/>
+          <w:sz w:val="20"/>
+        </w:rPr>
+        <w:t>189 trailers executed</w:t>
+      </w:r>
+      <w:r>
+        <w:rPr>
+          <w:b w:val="0"/>
+          <w:i w:val="0"/>
+          <w:sz w:val="20"/>
+        </w:rPr>
+        <w:t xml:space="preserve"> (the steering tracker had undercounted at 146; one manifest-flipped-but-never-moved load excluded). Measured all-in cost — Vegas dray + rail + destination dray — averaged </w:t>
+      </w:r>
+      <w:r>
+        <w:rPr>
+          <w:b/>
+          <w:i w:val="0"/>
+          <w:sz w:val="20"/>
+        </w:rPr>
+        <w:t>$3,946/trailer</w:t>
+      </w:r>
+      <w:r>
+        <w:rPr>
+          <w:b w:val="0"/>
+          <w:i w:val="0"/>
+          <w:sz w:val="20"/>
+        </w:rPr>
+        <w:t xml:space="preserve">, with the rail leg dropping 36% to a $2,313 flat rate ($1.18/mi) from WK18 after the procurement rate-parity push. Against prevailing OTR market rates on those lanes, estimated cost avoidance is </w:t>
+      </w:r>
+      <w:r>
+        <w:rPr>
+          <w:b/>
+          <w:i w:val="0"/>
+          <w:sz w:val="20"/>
+        </w:rPr>
+        <w:t>~$685K</w:t>
+      </w:r>
+      <w:r>
+        <w:rPr>
+          <w:b w:val="0"/>
+          <w:i w:val="0"/>
+          <w:sz w:val="20"/>
+        </w:rPr>
+        <w:t xml:space="preserve"> for the Q2 window.</w:t>
+      </w:r>
+    </w:p>
+    <w:p>
+      <w:pPr>
+        <w:spacing w:after="40"/>
+      </w:pPr>
+      <w:r>
+        <w:rPr>
+          <w:b/>
+          <w:i w:val="0"/>
+          <w:sz w:val="20"/>
+        </w:rPr>
+        <w:t xml:space="preserve">One finding worth your eyes: </w:t>
+      </w:r>
+      <w:r>
+        <w:rPr>
+          <w:b w:val="0"/>
+          <w:i w:val="0"/>
+          <w:sz w:val="20"/>
+        </w:rPr>
+        <w:t>pricing the OB NTI origin flips surfaced that the LAS1/VGT2 → Chicago-area corridor has essentially no OTR truckload history — it moves intermodal. Real OTR bookings we did force (Feb 2026, SIM record) ran $3.2–5.3K/load and were hard to cover; current market estimates run $6.3–9.1K/load. Practical implication for both our teams: on this corridor, rail/TOFC-style moves are structurally the right relief lever, and any "vs. OTR" economics should use market-rate estimates, not assume bookability at contract rates.</w:t>
+      </w:r>
+    </w:p>
     <w:sectPr>
       <w:pgSz w:w="12240" w:h="15840"/>
       <w:pgMar w:top="864" w:right="1152" w:bottom="864" w:left="1152" w:header="720" w:footer="720" w:gutter="0"/>

</xml_diff>